<commit_message>
Fix: fix missed name project in documentation
</commit_message>
<xml_diff>
--- a/Documentation/01-idea.docx
+++ b/Documentation/01-idea.docx
@@ -724,8 +724,6 @@
         </w:rPr>
       </w:pPr>
       <w:bookmarkStart w:id="0" w:name="_Toc243263523"/>
-      <w:bookmarkStart w:id="1" w:name="_GoBack"/>
-      <w:bookmarkEnd w:id="1"/>
       <w:r>
         <w:rPr>
           <w:rFonts w:eastAsia="Times New Roman"/>
@@ -748,7 +746,7 @@
           <w:lang w:eastAsia="ru-RU"/>
         </w:rPr>
       </w:pPr>
-      <w:bookmarkStart w:id="2" w:name="_Toc243263524"/>
+      <w:bookmarkStart w:id="1" w:name="_Toc243263524"/>
       <w:r>
         <w:rPr>
           <w:lang w:eastAsia="ru-RU"/>
@@ -761,7 +759,7 @@
         </w:rPr>
         <w:t>проекта</w:t>
       </w:r>
-      <w:bookmarkEnd w:id="2"/>
+      <w:bookmarkEnd w:id="1"/>
     </w:p>
     <w:p>
       <w:pPr>
@@ -774,7 +772,27 @@
         <w:rPr>
           <w:lang w:eastAsia="ru-RU"/>
         </w:rPr>
-        <w:t xml:space="preserve">Проект представляет собой мобильную игру в жанре детектив для платформы </w:t>
+        <w:t>Проект представляет собой мобильную игру</w:t>
+      </w:r>
+      <w:r>
+        <w:rPr>
+          <w:lang w:eastAsia="ru-RU"/>
+        </w:rPr>
+        <w:t xml:space="preserve"> «Холодный след</w:t>
+      </w:r>
+      <w:bookmarkStart w:id="2" w:name="_GoBack"/>
+      <w:bookmarkEnd w:id="2"/>
+      <w:r>
+        <w:rPr>
+          <w:lang w:eastAsia="ru-RU"/>
+        </w:rPr>
+        <w:t>»</w:t>
+      </w:r>
+      <w:r>
+        <w:rPr>
+          <w:lang w:eastAsia="ru-RU"/>
+        </w:rPr>
+        <w:t xml:space="preserve"> в жанре детектив для платформы </w:t>
       </w:r>
       <w:proofErr w:type="spellStart"/>
       <w:r>
@@ -8117,7 +8135,7 @@
 </file>
 
 <file path=customXml/itemProps1.xml><?xml version="1.0" encoding="utf-8"?>
-<ds:datastoreItem xmlns:ds="http://schemas.openxmlformats.org/officeDocument/2006/customXml" ds:itemID="{8374B50B-2DEF-4C5E-8C88-B9476065FF9B}">
+<ds:datastoreItem xmlns:ds="http://schemas.openxmlformats.org/officeDocument/2006/customXml" ds:itemID="{F3B081E5-CB14-493E-8B59-B2B1196D412D}">
   <ds:schemaRefs>
     <ds:schemaRef ds:uri="http://schemas.openxmlformats.org/officeDocument/2006/bibliography"/>
   </ds:schemaRefs>

</xml_diff>